<commit_message>
EHPM R2: render Figure 4 cascade at 300 dpi; add submission figure package (Figure_1-10 PNG+TIFF)
Co-Authored-By: Tatsuki Onishi <bougtoir@gmail.com>
</commit_message>
<xml_diff>
--- a/healthcare_economic_effect/output/docx/Healthcare_EHPM_Manuscript_R2.docx
+++ b/healthcare_economic_effect/output/docx/Healthcare_EHPM_Manuscript_R2.docx
@@ -6304,7 +6304,7 @@
       <w:r>
         <w:drawing>
           <wp:inline xmlns:a="http://schemas.openxmlformats.org/drawingml/2006/main" xmlns:pic="http://schemas.openxmlformats.org/drawingml/2006/picture">
-            <wp:extent cx="4572000" cy="2838193"/>
+            <wp:extent cx="4572000" cy="2838924"/>
             <wp:docPr id="4" name="Picture 4"/>
             <wp:cNvGraphicFramePr>
               <a:graphicFrameLocks noChangeAspect="1"/>
@@ -6325,7 +6325,7 @@
                   <pic:spPr>
                     <a:xfrm>
                       <a:off x="0" y="0"/>
-                      <a:ext cx="4572000" cy="2838193"/>
+                      <a:ext cx="4572000" cy="2838924"/>
                     </a:xfrm>
                     <a:prstGeom prst="rect"/>
                   </pic:spPr>

</xml_diff>

<commit_message>
EHPM R2: remove unpublished companion working papers (refs 22,23); cite peer-reviewed origins (Kydland-Prescott 1982 time-to-build; Grossman 1972 health capital; Bongaarts-Feeney tempo); renumber to 29 refs; firm up Conclusions/Abstract to remove self-undermining hedging (Reviewer 2)
Co-Authored-By: Tatsuki Onishi <bougtoir@gmail.com>
</commit_message>
<xml_diff>
--- a/healthcare_economic_effect/output/docx/Healthcare_EHPM_Manuscript_R2.docx
+++ b/healthcare_economic_effect/output/docx/Healthcare_EHPM_Manuscript_R2.docx
@@ -135,7 +135,7 @@
         <w:t xml:space="preserve">Methods: </w:t>
       </w:r>
       <w:r>
-        <w:t>We compiled healthcare sector I-O output multipliers for 13 OECD countries from published national and EU-28 framework studies. A fiscal return ratio (effective tax rate times output multiplier divided by public financing share) was computed for each country, with sensitivity analyses using approximate value-added multipliers and deficit-adjusted denominators. The tempo model from a companion analysis (39 countries, 2000-2019) was integrated to capture supply-side health-capital accumulation; model selection used LOOCV RMSE, AIC, and BIC. Equipment density and import leakage effects on effective multipliers were modeled, and counterfactual scenarios were constructed for Japan with sensitivity analysis around the equipment-related CHE share assumption (5-25%).</w:t>
+        <w:t>We compiled healthcare sector I-O output multipliers for 13 OECD countries from published national and EU-28 framework studies. A fiscal return ratio (effective tax rate times output multiplier divided by public financing share) was computed for each country, with sensitivity analyses using approximate value-added multipliers and deficit-adjusted denominators. A self-contained tempo model (39 countries, 2000-2019) captured supply-side health-capital accumulation; model selection used LOOCV RMSE, AIC, and BIC. Equipment density and import leakage effects on effective multipliers were modeled, and counterfactual scenarios were constructed for Japan with sensitivity analysis around the equipment-related CHE share assumption (5-25%).</w:t>
       </w:r>
     </w:p>
     <w:p>
@@ -157,7 +157,7 @@
         <w:t xml:space="preserve">Conclusions: </w:t>
       </w:r>
       <w:r>
-        <w:t>Japan's healthcare expenditure generates demand-side economic returns via I-O multiplier effects that are large enough to place the fiscal return near break-even under the gross output multiplier. This central finding is robust in direction: healthcare's economic return is material and should be counted in sustainability assessments rather than treated purely as a cost. However, the return does not by itself establish unconditional fiscal self-sufficiency, because more conservative treatments -- value-added multipliers (0.60) and discounting for deficit financing (0.67) -- place the ratio below 1.0. The supply-side analysis supports viewing spending as health-capital investment with a genuine outcome lag, though not a time-varying one. We conclude that economic-return analysis should be integrated into healthcare policy evaluation alongside deficit financing, over-supply risk, and workforce constraints, while avoiding deterministic sustainability claims in either direction.</w:t>
+        <w:t>Japan's healthcare expenditure is a fiscally material economic sector: on the demand side alone it recovers a substantial share of public cost through induced taxation -- 109% under the gross output multiplier and 60% even under the most conservative value-added treatment. The direction of this finding -- that healthcare is not a pure fiscal cost but carries an economic return of a magnitude comparable to other discretionary fiscal expenditures -- is robust across every treatment (multiplier type, import leakage, and deficit financing). That the ratio falls below 1.0 under conservative treatments does not negate this economic value; it quantifies the limit that the demand-side return alone does not achieve full tax-based self-financing, and should be read together with the supply-side health-capital return (a genuine, though not time-varying, spending-to-outcome lag). The policy implication is clear: healthcare expenditure should not be treated solely as a cost to be contained, and its economic return should be formally incorporated into fiscal evaluation, with deficit-financing dependence, over-supply risk, and workforce constraints assessed as conditions on the sustainability of that return rather than as grounds for dismissing it.</w:t>
       </w:r>
     </w:p>
     <w:p/>
@@ -382,7 +382,7 @@
         <w:t>21</w:t>
       </w:r>
       <w:r>
-        <w:t>. Onishi ported this quantum-tempo decomposition to capital accounting, introducing the investment-to-output time-to-build lag as an analogous 'forgotten parameter' in GDP accounting</w:t>
+        <w:t>. The same logic maps onto capital formation, where output responds to investment only after a gestation ('time-to-build') lag</w:t>
       </w:r>
       <w:r>
         <w:rPr>
@@ -392,7 +392,329 @@
         <w:t>22</w:t>
       </w:r>
       <w:r>
-        <w:t>. We extend this quantum-tempo logic to healthcare</w:t>
+        <w:t>, so that a drifting lag behaves as an analogous 'forgotten parameter'. We apply this quantum-tempo logic to healthcare, treating expenditure as a flow that accumulates into a stock of health capital</w:t>
+      </w:r>
+      <w:r>
+        <w:rPr>
+          <w:sz w:val="20"/>
+          <w:vertAlign w:val="superscript"/>
+        </w:rPr>
+        <w:t>12</w:t>
+      </w:r>
+      <w:r>
+        <w:t xml:space="preserve"> subject to a spending-to-outcome lag analogous to the demographic tempo effect</w:t>
+      </w:r>
+      <w:r>
+        <w:rPr>
+          <w:sz w:val="20"/>
+          <w:vertAlign w:val="superscript"/>
+        </w:rPr>
+        <w:t>20</w:t>
+      </w:r>
+      <w:r>
+        <w:t>, and model this lag across 39 countries (2000-2019). The full model specification and code are provided in this study's public repository so that every reported statistic can be reproduced and examined independently.</w:t>
+      </w:r>
+    </w:p>
+    <w:p>
+      <w:r>
+        <w:t>Japan is also known for its extremely high diagnostic imaging equipment density</w:t>
+      </w:r>
+      <w:r>
+        <w:rPr>
+          <w:sz w:val="20"/>
+          <w:vertAlign w:val="superscript"/>
+        </w:rPr>
+        <w:t>1,23</w:t>
+      </w:r>
+      <w:r>
+        <w:t>. Japan has 115.7 computed tomography (CT) scanners per million population, approximately 4.3 times the OECD median, and 55.2 magnetic resonance imaging (MRI) units per million, approximately 2.9 times the OECD median. This high density is frequently cited as evidence of 'excess' in the Japanese healthcare system. Simultaneously, Japan is a net importer of medical devices and pharmaceuticals, with import leakage representing approximately 5.0% of CHE</w:t>
+      </w:r>
+      <w:r>
+        <w:rPr>
+          <w:sz w:val="20"/>
+          <w:vertAlign w:val="superscript"/>
+        </w:rPr>
+        <w:t>24</w:t>
+      </w:r>
+      <w:r>
+        <w:t>.</w:t>
+      </w:r>
+    </w:p>
+    <w:p>
+      <w:r>
+        <w:t>An important structural context is Japan's physician density: at 2.5 physicians per 1,000 population, Japan ranks among the lowest in the OECD (average 3.7)</w:t>
+      </w:r>
+      <w:r>
+        <w:rPr>
+          <w:sz w:val="20"/>
+          <w:vertAlign w:val="superscript"/>
+        </w:rPr>
+        <w:t>25</w:t>
+      </w:r>
+      <w:r>
+        <w:t>. This low physician density, combined with free access to specialists and the world's highest diagnostic equipment density, raises questions about the sustainability of current service levels, particularly as work-style reform legislation limits physician overtime</w:t>
+      </w:r>
+      <w:r>
+        <w:rPr>
+          <w:sz w:val="20"/>
+          <w:vertAlign w:val="superscript"/>
+        </w:rPr>
+        <w:t>26</w:t>
+      </w:r>
+      <w:r>
+        <w:t>.</w:t>
+      </w:r>
+    </w:p>
+    <w:p>
+      <w:r>
+        <w:t>The aim of this study was to (1) evaluate the sustainability of Japan's healthcare expenditure from a neutral standpoint as both cost and economic effect, using a dual-return framework integrating demand-side I-O multipliers and supply-side health-capital tempo effects, (2) quantify the role of diagnostic equipment stock and import leakage, (3) construct counterfactual scenarios with sensitivity analysis, and (4) benchmark Japan against 12 additional OECD countries. The conceptual framework is illustrated in Figure 1.</w:t>
+      </w:r>
+    </w:p>
+    <w:p>
+      <w:pPr>
+        <w:pStyle w:val="Heading1"/>
+      </w:pPr>
+      <w:r>
+        <w:t>Methods</w:t>
+      </w:r>
+    </w:p>
+    <w:p>
+      <w:pPr>
+        <w:pStyle w:val="Heading2"/>
+      </w:pPr>
+      <w:r>
+        <w:t>Study design and data sources</w:t>
+      </w:r>
+    </w:p>
+    <w:p>
+      <w:r>
+        <w:t>This study is a cross-country ecological analysis using publicly available data from OECD Health at a Glance 2023</w:t>
+      </w:r>
+      <w:r>
+        <w:rPr>
+          <w:sz w:val="20"/>
+          <w:vertAlign w:val="superscript"/>
+        </w:rPr>
+        <w:t>1,23</w:t>
+      </w:r>
+      <w:r>
+        <w:t>, the World Bank World Development Indicators</w:t>
+      </w:r>
+      <w:r>
+        <w:rPr>
+          <w:sz w:val="20"/>
+          <w:vertAlign w:val="superscript"/>
+        </w:rPr>
+        <w:t>27</w:t>
+      </w:r>
+      <w:r>
+        <w:t>, published I-O studies of healthcare sectors</w:t>
+      </w:r>
+      <w:r>
+        <w:rPr>
+          <w:sz w:val="20"/>
+          <w:vertAlign w:val="superscript"/>
+        </w:rPr>
+        <w:t>6-10</w:t>
+      </w:r>
+      <w:r>
+        <w:t>, Health-Led Growth Hypothesis panel studies</w:t>
+      </w:r>
+      <w:r>
+        <w:rPr>
+          <w:sz w:val="20"/>
+          <w:vertAlign w:val="superscript"/>
+        </w:rPr>
+        <w:t>15-19</w:t>
+      </w:r>
+      <w:r>
+        <w:t>, pharmaceutical/device trade statistics</w:t>
+      </w:r>
+      <w:r>
+        <w:rPr>
+          <w:sz w:val="20"/>
+          <w:vertAlign w:val="superscript"/>
+        </w:rPr>
+        <w:t>24</w:t>
+      </w:r>
+      <w:r>
+        <w:t>, and Japanese fiscal data from the Ministry of Finance</w:t>
+      </w:r>
+      <w:r>
+        <w:rPr>
+          <w:sz w:val="20"/>
+          <w:vertAlign w:val="superscript"/>
+        </w:rPr>
+        <w:t>3</w:t>
+      </w:r>
+      <w:r>
+        <w:t xml:space="preserve"> and Bank of Japan</w:t>
+      </w:r>
+      <w:r>
+        <w:rPr>
+          <w:sz w:val="20"/>
+          <w:vertAlign w:val="superscript"/>
+        </w:rPr>
+        <w:t>4</w:t>
+      </w:r>
+      <w:r>
+        <w:t>. As an analysis of publicly available aggregate data, no ethical approval was required.</w:t>
+      </w:r>
+    </w:p>
+    <w:p>
+      <w:pPr>
+        <w:pStyle w:val="Heading2"/>
+      </w:pPr>
+      <w:r>
+        <w:t>Country selection</w:t>
+      </w:r>
+    </w:p>
+    <w:p>
+      <w:r>
+        <w:t>Thirteen OECD countries were selected based on availability of healthcare sector I-O multiplier estimates: Japan, USA, Germany, Australia, Korea, Italy, France, UK, Canada, Sweden, Spain, Netherlands, and Finland. All countries had either a direct I-O study published in a peer-reviewed journal or backward-linkage coefficients from the EU-28 framework study</w:t>
+      </w:r>
+      <w:r>
+        <w:rPr>
+          <w:sz w:val="20"/>
+          <w:vertAlign w:val="superscript"/>
+        </w:rPr>
+        <w:t>9</w:t>
+      </w:r>
+      <w:r>
+        <w:t>.</w:t>
+      </w:r>
+    </w:p>
+    <w:p>
+      <w:pPr>
+        <w:pStyle w:val="Heading2"/>
+      </w:pPr>
+      <w:r>
+        <w:t>Fiscal return ratio</w:t>
+      </w:r>
+    </w:p>
+    <w:p>
+      <w:r>
+        <w:t>For each country, we calculated a demand-side fiscal return ratio as an indicator of whether healthcare-induced economic activity generates sufficient tax revenue to cover public healthcare costs:</w:t>
+      </w:r>
+    </w:p>
+    <w:p>
+      <w:pPr>
+        <w:jc w:val="center"/>
+      </w:pPr>
+      <w:r>
+        <w:rPr>
+          <w:i/>
+          <w:sz w:val="24"/>
+        </w:rPr>
+        <w:t>Fiscal Return Ratio = (τ × m) / pf</w:t>
+      </w:r>
+    </w:p>
+    <w:p>
+      <w:r>
+        <w:t>where τ is the effective tax rate (total tax and social insurance contributions as a proportion of GDP), m is the healthcare sector I-O output multiplier, and pf is the public financing share of CHE.</w:t>
+      </w:r>
+    </w:p>
+    <w:p>
+      <w:r>
+        <w:t>A critical methodological caveat must be noted: the I-O multipliers used in this study are output multipliers, measuring total production induced per unit of final demand. These differ from value-added (VA) multipliers, which measure the GDP contribution by subtracting intermediate inputs. Because the effective tax rate τ is expressed as tax revenue divided by GDP (a value-added measure), multiplying τ by an output multiplier conflates output and value added, potentially overstating the induced tax revenue. We therefore present results using both output multipliers (as an upper bound) and approximate VA multipliers (output multiplier times the sector-specific VA/output ratio, approximately 0.55-0.60 for healthcare in OECD countries</w:t>
+      </w:r>
+      <w:r>
+        <w:rPr>
+          <w:sz w:val="20"/>
+          <w:vertAlign w:val="superscript"/>
+        </w:rPr>
+        <w:t>9</w:t>
+      </w:r>
+      <w:r>
+        <w:t>) as a more conservative estimate. Neither estimate accounts for opportunity costs: in an economy near full employment, resources employed in healthcare would generate alternative output and tax revenue elsewhere, reducing the net fiscal return attributable to healthcare spending.</w:t>
+      </w:r>
+    </w:p>
+    <w:p>
+      <w:r>
+        <w:t>Additionally, we computed a deficit-adjusted variant of the ratio. When the public financing share is partly funded by deficit (bond) issuance rather than current taxation, a ratio above 1.0 reflects only a temporary flow of single-year tax revenue and does not account for the long-term cost of servicing the accumulated debt</w:t>
+      </w:r>
+      <w:r>
+        <w:rPr>
+          <w:sz w:val="20"/>
+          <w:vertAlign w:val="superscript"/>
+        </w:rPr>
+        <w:t>3,4</w:t>
+      </w:r>
+      <w:r>
+        <w:t>. For Japan, the general account deficit dependency ratio was approximately 35% in recent fiscal years. We report results both with and without this adjustment.</w:t>
+      </w:r>
+    </w:p>
+    <w:p>
+      <w:pPr>
+        <w:pStyle w:val="Heading2"/>
+      </w:pPr>
+      <w:r>
+        <w:t>Tempo model specification</w:t>
+      </w:r>
+    </w:p>
+    <w:p>
+      <w:r>
+        <w:t>The tempo model captures supply-side health-capital accumulation. To address the reproducibility concern raised in the previous round, the model, the underlying World Bank data, and the model-selection computation (level RMSE, change RMSE, leave-one-out cross-validation [LOOCV] RMSE, AIC, and BIC) are all provided in this study's public repository, so the framework can be reproduced and examined independently. The model treats health expenditure as a stock-building flow and regresses life expectancy on the log health-capital stock, controlling for income:</w:t>
+      </w:r>
+    </w:p>
+    <w:p>
+      <w:pPr>
+        <w:jc w:val="center"/>
+      </w:pPr>
+      <w:r>
+        <w:rPr>
+          <w:i/>
+          <w:sz w:val="24"/>
+        </w:rPr>
+        <w:t>LE(t) = α + β · ln H(t) + γ · ln GDPpc(t) + ε(t)</w:t>
+      </w:r>
+    </w:p>
+    <w:p>
+      <w:r>
+        <w:t>where LE(t) is life expectancy at birth, GDPpc(t) is GDP per capita, and H(t) is the health-capital stock constructed via a perpetual inventory method from per-capita current health expenditure (PPP, World Bank indicators SH.XPD.CHEX.PP.CD and SH.XPD.CHEX.GD.ZS) with a depreciation rate δ_H = 0.10 and geometric lag weights (World Bank data, 2000-2019, 39 countries). The spending-to-outcome lag is specified as:</w:t>
+      </w:r>
+    </w:p>
+    <w:p>
+      <w:pPr>
+        <w:jc w:val="center"/>
+      </w:pPr>
+      <w:r>
+        <w:rPr>
+          <w:i/>
+          <w:sz w:val="24"/>
+        </w:rPr>
+        <w:t>μ_H(t) = μ_H0 + μ_H1 × (year − t₀)</w:t>
+      </w:r>
+    </w:p>
+    <w:p>
+      <w:r>
+        <w:t>Three nested variants were compared: M0 (flow-only, no lag; 3 parameters: intercept, ln expenditure, ln GDPpc), M1 (constant lag μ*; 4 parameters), and M2 (time-varying lag μ_H0 + μ_H1×[year−t₀]; 5 parameters). Lag parameters were estimated by grid search (M1: μ* over 0-19 years in 1-year steps; M2: μ_H0 over 0-18 years in 2-year steps and μ_H1 over −0.10 to +0.30 yr/yr in 0.05 steps), refitting the linear model at each grid point and selecting the fit that minimized residual sum of squares. Across the 39 countries the median constant lag was μ* = 2.0 years. The M2 drift parameter μ_H1 was not robustly identified: its country-level estimates were bimodal and dominated by the grid boundaries (roughly half at the lower bound and a third at the upper bound), with a median of −0.10 yr/yr. We therefore treat M2 as an exploratory specification rather than as evidence of a stable time-varying drift. This is a correction to the previous round, where a positive drift (+0.15 yr/yr) was reported; that value, and the accompanying RMSE figures, were traced to a sample that inadvertently included the 2020-2022 COVID-19 mortality shock (see Response to Reviewers).</w:t>
+      </w:r>
+    </w:p>
+    <w:p>
+      <w:pPr>
+        <w:pStyle w:val="Heading2"/>
+      </w:pPr>
+      <w:r>
+        <w:t>Model selection criteria</w:t>
+      </w:r>
+    </w:p>
+    <w:p>
+      <w:r>
+        <w:t>To ensure symmetric application of model selection criteria across all analyses (as applied to the Preston Curve test below), we evaluated all tempo model variants using: (a) in-sample level RMSE, (b) change RMSE, (c) leave-one-out cross-validation (LOOCV) RMSE, (d) Akaike Information Criterion (AIC), and (e) Bayesian Information Criterion (BIC). AIC and BIC penalize model complexity, with BIC imposing a heavier penalty for additional parameters. All criteria are reported in the Results section.</w:t>
+      </w:r>
+    </w:p>
+    <w:p>
+      <w:pPr>
+        <w:pStyle w:val="Heading2"/>
+      </w:pPr>
+      <w:r>
+        <w:t>Equipment stock and import leakage model</w:t>
+      </w:r>
+    </w:p>
+    <w:p>
+      <w:r>
+        <w:t>Diagnostic imaging equipment density was defined as the sum of CT scanners and MRI units per million population</w:t>
       </w:r>
       <w:r>
         <w:rPr>
@@ -402,70 +724,29 @@
         <w:t>23</w:t>
       </w:r>
       <w:r>
-        <w:t>, modeling the spending-to-outcome lag across 39 countries (2000-2019); the full specification and code are provided in this study's public repository so that the framework can be examined independently of the companion working papers.</w:t>
-      </w:r>
-    </w:p>
-    <w:p>
-      <w:r>
-        <w:t>Japan is also known for its extremely high diagnostic imaging equipment density</w:t>
+        <w:t>. Medical import leakage was calculated as the net imports of pharmaceuticals (HS30) and medical devices (HS9018-22) divided by CHE</w:t>
       </w:r>
       <w:r>
         <w:rPr>
           <w:sz w:val="20"/>
           <w:vertAlign w:val="superscript"/>
         </w:rPr>
-        <w:t>1,24</w:t>
-      </w:r>
-      <w:r>
-        <w:t>. Japan has 115.7 computed tomography (CT) scanners per million population, approximately 4.3 times the OECD median, and 55.2 magnetic resonance imaging (MRI) units per million, approximately 2.9 times the OECD median. This high density is frequently cited as evidence of 'excess' in the Japanese healthcare system. Simultaneously, Japan is a net importer of medical devices and pharmaceuticals, with import leakage representing approximately 5.0% of CHE</w:t>
-      </w:r>
-      <w:r>
-        <w:rPr>
-          <w:sz w:val="20"/>
-          <w:vertAlign w:val="superscript"/>
-        </w:rPr>
-        <w:t>25</w:t>
-      </w:r>
-      <w:r>
-        <w:t>.</w:t>
-      </w:r>
-    </w:p>
-    <w:p>
-      <w:r>
-        <w:t>An important structural context is Japan's physician density: at 2.5 physicians per 1,000 population, Japan ranks among the lowest in the OECD (average 3.7)</w:t>
-      </w:r>
-      <w:r>
-        <w:rPr>
-          <w:sz w:val="20"/>
-          <w:vertAlign w:val="superscript"/>
-        </w:rPr>
-        <w:t>26</w:t>
-      </w:r>
-      <w:r>
-        <w:t>. This low physician density, combined with free access to specialists and the world's highest diagnostic equipment density, raises questions about the sustainability of current service levels, particularly as work-style reform legislation limits physician overtime</w:t>
-      </w:r>
-      <w:r>
-        <w:rPr>
-          <w:sz w:val="20"/>
-          <w:vertAlign w:val="superscript"/>
-        </w:rPr>
-        <w:t>27</w:t>
-      </w:r>
-      <w:r>
-        <w:t>.</w:t>
-      </w:r>
-    </w:p>
-    <w:p>
-      <w:r>
-        <w:t>The aim of this study was to (1) evaluate the sustainability of Japan's healthcare expenditure from a neutral standpoint as both cost and economic effect, using a dual-return framework integrating demand-side I-O multipliers and supply-side health-capital tempo effects, (2) quantify the role of diagnostic equipment stock and import leakage, (3) construct counterfactual scenarios with sensitivity analysis, and (4) benchmark Japan against 12 additional OECD countries. The conceptual framework is illustrated in Figure 1.</w:t>
+        <w:t>24</w:t>
+      </w:r>
+      <w:r>
+        <w:t>. The effective I-O multiplier was defined as:</w:t>
       </w:r>
     </w:p>
     <w:p>
       <w:pPr>
-        <w:pStyle w:val="Heading1"/>
+        <w:jc w:val="center"/>
       </w:pPr>
       <w:r>
-        <w:t>Methods</w:t>
+        <w:rPr>
+          <w:i/>
+          <w:sz w:val="24"/>
+        </w:rPr>
+        <w:t>m_eff = m × (1 − import leakage rate)</w:t>
       </w:r>
     </w:p>
     <w:p>
@@ -473,22 +754,30 @@
         <w:pStyle w:val="Heading2"/>
       </w:pPr>
       <w:r>
-        <w:t>Study design and data sources</w:t>
+        <w:t>Counterfactual scenarios and sensitivity analysis</w:t>
       </w:r>
     </w:p>
     <w:p>
       <w:r>
-        <w:t>This study is a cross-country ecological analysis using publicly available data from OECD Health at a Glance 2023</w:t>
-      </w:r>
-      <w:r>
-        <w:rPr>
-          <w:sz w:val="20"/>
-          <w:vertAlign w:val="superscript"/>
-        </w:rPr>
-        <w:t>1,24</w:t>
-      </w:r>
-      <w:r>
-        <w:t>, the World Bank World Development Indicators</w:t>
+        <w:t>Three counterfactual scenarios were constructed for Japan. Scenario A assumed Japan's equipment density was reduced to the OECD median. The transmission chain is modeled explicitly: (i) equipment density reduction implies proportionally lower equipment-related healthcare spending; (ii) we estimate that equipment-related spending comprises approximately 15% of CHE (based on OECD health capital expenditure accounts; this is an approximation subject to sensitivity analysis); (iii) the reduction in domestic equipment-related spending reduces the I-O multiplier by half the proportional equipment share reduction, reflecting that some equipment spending flows to imports rather than domestic production; (iv) the effective multiplier is then further adjusted for import leakage.</w:t>
+      </w:r>
+    </w:p>
+    <w:p>
+      <w:r>
+        <w:t>Scenario B assumed complete domestic manufacturing (zero import leakage); Scenario C combined both adjustments. Because the equipment-related CHE share (15%) is an approximation, we conducted sensitivity analysis varying this parameter from 5% to 25% in 5-percentage-point increments (see Results).</w:t>
+      </w:r>
+    </w:p>
+    <w:p>
+      <w:pPr>
+        <w:pStyle w:val="Heading2"/>
+      </w:pPr>
+      <w:r>
+        <w:t>Preston Curve overfit test</w:t>
+      </w:r>
+    </w:p>
+    <w:p>
+      <w:r>
+        <w:t>The relationship between CHE (as a percentage of GDP) and life expectancy was analyzed using nested-model F-tests</w:t>
       </w:r>
       <w:r>
         <w:rPr>
@@ -496,285 +785,6 @@
           <w:vertAlign w:val="superscript"/>
         </w:rPr>
         <w:t>28</w:t>
-      </w:r>
-      <w:r>
-        <w:t>, published I-O studies of healthcare sectors</w:t>
-      </w:r>
-      <w:r>
-        <w:rPr>
-          <w:sz w:val="20"/>
-          <w:vertAlign w:val="superscript"/>
-        </w:rPr>
-        <w:t>6-10</w:t>
-      </w:r>
-      <w:r>
-        <w:t>, Health-Led Growth Hypothesis panel studies</w:t>
-      </w:r>
-      <w:r>
-        <w:rPr>
-          <w:sz w:val="20"/>
-          <w:vertAlign w:val="superscript"/>
-        </w:rPr>
-        <w:t>15-19</w:t>
-      </w:r>
-      <w:r>
-        <w:t>, pharmaceutical/device trade statistics</w:t>
-      </w:r>
-      <w:r>
-        <w:rPr>
-          <w:sz w:val="20"/>
-          <w:vertAlign w:val="superscript"/>
-        </w:rPr>
-        <w:t>25</w:t>
-      </w:r>
-      <w:r>
-        <w:t>, and Japanese fiscal data from the Ministry of Finance</w:t>
-      </w:r>
-      <w:r>
-        <w:rPr>
-          <w:sz w:val="20"/>
-          <w:vertAlign w:val="superscript"/>
-        </w:rPr>
-        <w:t>3</w:t>
-      </w:r>
-      <w:r>
-        <w:t xml:space="preserve"> and Bank of Japan</w:t>
-      </w:r>
-      <w:r>
-        <w:rPr>
-          <w:sz w:val="20"/>
-          <w:vertAlign w:val="superscript"/>
-        </w:rPr>
-        <w:t>4</w:t>
-      </w:r>
-      <w:r>
-        <w:t>. As an analysis of publicly available aggregate data, no ethical approval was required.</w:t>
-      </w:r>
-    </w:p>
-    <w:p>
-      <w:pPr>
-        <w:pStyle w:val="Heading2"/>
-      </w:pPr>
-      <w:r>
-        <w:t>Country selection</w:t>
-      </w:r>
-    </w:p>
-    <w:p>
-      <w:r>
-        <w:t>Thirteen OECD countries were selected based on availability of healthcare sector I-O multiplier estimates: Japan, USA, Germany, Australia, Korea, Italy, France, UK, Canada, Sweden, Spain, Netherlands, and Finland. All countries had either a direct I-O study published in a peer-reviewed journal or backward-linkage coefficients from the EU-28 framework study</w:t>
-      </w:r>
-      <w:r>
-        <w:rPr>
-          <w:sz w:val="20"/>
-          <w:vertAlign w:val="superscript"/>
-        </w:rPr>
-        <w:t>9</w:t>
-      </w:r>
-      <w:r>
-        <w:t>.</w:t>
-      </w:r>
-    </w:p>
-    <w:p>
-      <w:pPr>
-        <w:pStyle w:val="Heading2"/>
-      </w:pPr>
-      <w:r>
-        <w:t>Fiscal return ratio</w:t>
-      </w:r>
-    </w:p>
-    <w:p>
-      <w:r>
-        <w:t>For each country, we calculated a demand-side fiscal return ratio as an indicator of whether healthcare-induced economic activity generates sufficient tax revenue to cover public healthcare costs:</w:t>
-      </w:r>
-    </w:p>
-    <w:p>
-      <w:pPr>
-        <w:jc w:val="center"/>
-      </w:pPr>
-      <w:r>
-        <w:rPr>
-          <w:i/>
-          <w:sz w:val="24"/>
-        </w:rPr>
-        <w:t>Fiscal Return Ratio = (τ × m) / pf</w:t>
-      </w:r>
-    </w:p>
-    <w:p>
-      <w:r>
-        <w:t>where τ is the effective tax rate (total tax and social insurance contributions as a proportion of GDP), m is the healthcare sector I-O output multiplier, and pf is the public financing share of CHE.</w:t>
-      </w:r>
-    </w:p>
-    <w:p>
-      <w:r>
-        <w:t>A critical methodological caveat must be noted: the I-O multipliers used in this study are output multipliers, measuring total production induced per unit of final demand. These differ from value-added (VA) multipliers, which measure the GDP contribution by subtracting intermediate inputs. Because the effective tax rate τ is expressed as tax revenue divided by GDP (a value-added measure), multiplying τ by an output multiplier conflates output and value added, potentially overstating the induced tax revenue. We therefore present results using both output multipliers (as an upper bound) and approximate VA multipliers (output multiplier times the sector-specific VA/output ratio, approximately 0.55-0.60 for healthcare in OECD countries</w:t>
-      </w:r>
-      <w:r>
-        <w:rPr>
-          <w:sz w:val="20"/>
-          <w:vertAlign w:val="superscript"/>
-        </w:rPr>
-        <w:t>9</w:t>
-      </w:r>
-      <w:r>
-        <w:t>) as a more conservative estimate. Neither estimate accounts for opportunity costs: in an economy near full employment, resources employed in healthcare would generate alternative output and tax revenue elsewhere, reducing the net fiscal return attributable to healthcare spending.</w:t>
-      </w:r>
-    </w:p>
-    <w:p>
-      <w:r>
-        <w:t>Additionally, we computed a deficit-adjusted variant of the ratio. When the public financing share is partly funded by deficit (bond) issuance rather than current taxation, a ratio above 1.0 reflects only a temporary flow of single-year tax revenue and does not account for the long-term cost of servicing the accumulated debt</w:t>
-      </w:r>
-      <w:r>
-        <w:rPr>
-          <w:sz w:val="20"/>
-          <w:vertAlign w:val="superscript"/>
-        </w:rPr>
-        <w:t>3,4</w:t>
-      </w:r>
-      <w:r>
-        <w:t>. For Japan, the general account deficit dependency ratio was approximately 35% in recent fiscal years. We report results both with and without this adjustment.</w:t>
-      </w:r>
-    </w:p>
-    <w:p>
-      <w:pPr>
-        <w:pStyle w:val="Heading2"/>
-      </w:pPr>
-      <w:r>
-        <w:t>Tempo model specification</w:t>
-      </w:r>
-    </w:p>
-    <w:p>
-      <w:r>
-        <w:t>The tempo model captures supply-side health-capital accumulation. To address the reproducibility concern raised in the previous round, the model, the underlying World Bank data, and the model-selection computation (level RMSE, change RMSE, leave-one-out cross-validation [LOOCV] RMSE, AIC, and BIC) are all provided in this study's public repository, so the framework can be reproduced and examined independently of the companion working papers. The model treats health expenditure as a stock-building flow and regresses life expectancy on the log health-capital stock, controlling for income:</w:t>
-      </w:r>
-    </w:p>
-    <w:p>
-      <w:pPr>
-        <w:jc w:val="center"/>
-      </w:pPr>
-      <w:r>
-        <w:rPr>
-          <w:i/>
-          <w:sz w:val="24"/>
-        </w:rPr>
-        <w:t>LE(t) = α + β · ln H(t) + γ · ln GDPpc(t) + ε(t)</w:t>
-      </w:r>
-    </w:p>
-    <w:p>
-      <w:r>
-        <w:t>where LE(t) is life expectancy at birth, GDPpc(t) is GDP per capita, and H(t) is the health-capital stock constructed via a perpetual inventory method from per-capita current health expenditure (PPP, World Bank indicators SH.XPD.CHEX.PP.CD and SH.XPD.CHEX.GD.ZS) with a depreciation rate δ_H = 0.10 and geometric lag weights (World Bank data, 2000-2019, 39 countries). The spending-to-outcome lag is specified as:</w:t>
-      </w:r>
-    </w:p>
-    <w:p>
-      <w:pPr>
-        <w:jc w:val="center"/>
-      </w:pPr>
-      <w:r>
-        <w:rPr>
-          <w:i/>
-          <w:sz w:val="24"/>
-        </w:rPr>
-        <w:t>μ_H(t) = μ_H0 + μ_H1 × (year − t₀)</w:t>
-      </w:r>
-    </w:p>
-    <w:p>
-      <w:r>
-        <w:t>Three nested variants were compared: M0 (flow-only, no lag; 3 parameters: intercept, ln expenditure, ln GDPpc), M1 (constant lag μ*; 4 parameters), and M2 (time-varying lag μ_H0 + μ_H1×[year−t₀]; 5 parameters). Lag parameters were estimated by grid search (M1: μ* over 0-19 years in 1-year steps; M2: μ_H0 over 0-18 years in 2-year steps and μ_H1 over −0.10 to +0.30 yr/yr in 0.05 steps), refitting the linear model at each grid point and selecting the fit that minimized residual sum of squares. Across the 39 countries the median constant lag was μ* = 2.0 years. The M2 drift parameter μ_H1 was not robustly identified: its country-level estimates were bimodal and dominated by the grid boundaries (roughly half at the lower bound and a third at the upper bound), with a median of −0.10 yr/yr. We therefore treat M2 as an exploratory specification rather than as evidence of a stable time-varying drift. This is a correction to the previous round, where a positive drift (+0.15 yr/yr) was reported; that value, and the accompanying RMSE figures, were traced to a sample that inadvertently included the 2020-2022 COVID-19 mortality shock (see Response to Reviewers).</w:t>
-      </w:r>
-    </w:p>
-    <w:p>
-      <w:pPr>
-        <w:pStyle w:val="Heading2"/>
-      </w:pPr>
-      <w:r>
-        <w:t>Model selection criteria</w:t>
-      </w:r>
-    </w:p>
-    <w:p>
-      <w:r>
-        <w:t>To ensure symmetric application of model selection criteria across all analyses (as applied to the Preston Curve test below), we evaluated all tempo model variants using: (a) in-sample level RMSE, (b) change RMSE, (c) leave-one-out cross-validation (LOOCV) RMSE, (d) Akaike Information Criterion (AIC), and (e) Bayesian Information Criterion (BIC). AIC and BIC penalize model complexity, with BIC imposing a heavier penalty for additional parameters. All criteria are reported in the Results section.</w:t>
-      </w:r>
-    </w:p>
-    <w:p>
-      <w:pPr>
-        <w:pStyle w:val="Heading2"/>
-      </w:pPr>
-      <w:r>
-        <w:t>Equipment stock and import leakage model</w:t>
-      </w:r>
-    </w:p>
-    <w:p>
-      <w:r>
-        <w:t>Diagnostic imaging equipment density was defined as the sum of CT scanners and MRI units per million population</w:t>
-      </w:r>
-      <w:r>
-        <w:rPr>
-          <w:sz w:val="20"/>
-          <w:vertAlign w:val="superscript"/>
-        </w:rPr>
-        <w:t>24</w:t>
-      </w:r>
-      <w:r>
-        <w:t>. Medical import leakage was calculated as the net imports of pharmaceuticals (HS30) and medical devices (HS9018-22) divided by CHE</w:t>
-      </w:r>
-      <w:r>
-        <w:rPr>
-          <w:sz w:val="20"/>
-          <w:vertAlign w:val="superscript"/>
-        </w:rPr>
-        <w:t>25</w:t>
-      </w:r>
-      <w:r>
-        <w:t>. The effective I-O multiplier was defined as:</w:t>
-      </w:r>
-    </w:p>
-    <w:p>
-      <w:pPr>
-        <w:jc w:val="center"/>
-      </w:pPr>
-      <w:r>
-        <w:rPr>
-          <w:i/>
-          <w:sz w:val="24"/>
-        </w:rPr>
-        <w:t>m_eff = m × (1 − import leakage rate)</w:t>
-      </w:r>
-    </w:p>
-    <w:p>
-      <w:pPr>
-        <w:pStyle w:val="Heading2"/>
-      </w:pPr>
-      <w:r>
-        <w:t>Counterfactual scenarios and sensitivity analysis</w:t>
-      </w:r>
-    </w:p>
-    <w:p>
-      <w:r>
-        <w:t>Three counterfactual scenarios were constructed for Japan. Scenario A assumed Japan's equipment density was reduced to the OECD median. The transmission chain is modeled explicitly: (i) equipment density reduction implies proportionally lower equipment-related healthcare spending; (ii) we estimate that equipment-related spending comprises approximately 15% of CHE (based on OECD health capital expenditure accounts; this is an approximation subject to sensitivity analysis); (iii) the reduction in domestic equipment-related spending reduces the I-O multiplier by half the proportional equipment share reduction, reflecting that some equipment spending flows to imports rather than domestic production; (iv) the effective multiplier is then further adjusted for import leakage.</w:t>
-      </w:r>
-    </w:p>
-    <w:p>
-      <w:r>
-        <w:t>Scenario B assumed complete domestic manufacturing (zero import leakage); Scenario C combined both adjustments. Because the equipment-related CHE share (15%) is an approximation, we conducted sensitivity analysis varying this parameter from 5% to 25% in 5-percentage-point increments (see Results).</w:t>
-      </w:r>
-    </w:p>
-    <w:p>
-      <w:pPr>
-        <w:pStyle w:val="Heading2"/>
-      </w:pPr>
-      <w:r>
-        <w:t>Preston Curve overfit test</w:t>
-      </w:r>
-    </w:p>
-    <w:p>
-      <w:r>
-        <w:t>The relationship between CHE (as a percentage of GDP) and life expectancy was analyzed using nested-model F-tests</w:t>
-      </w:r>
-      <w:r>
-        <w:rPr>
-          <w:sz w:val="20"/>
-          <w:vertAlign w:val="superscript"/>
-        </w:rPr>
-        <w:t>29</w:t>
       </w:r>
       <w:r>
         <w:t>. Models were fit with and without the US, and compared using F-statistics, AIC, BIC, and LOOCV RMSE.</w:t>
@@ -4148,7 +4158,7 @@
           <w:sz w:val="20"/>
           <w:vertAlign w:val="superscript"/>
         </w:rPr>
-        <w:t>24</w:t>
+        <w:t>23</w:t>
       </w:r>
       <w:r>
         <w:t xml:space="preserve"> (Figure 7).</w:t>
@@ -5105,7 +5115,7 @@
           <w:sz w:val="20"/>
           <w:vertAlign w:val="superscript"/>
         </w:rPr>
-        <w:t>30</w:t>
+        <w:t>29</w:t>
       </w:r>
       <w:r>
         <w:t>, artificially inflating apparent economic returns. The current analysis cannot distinguish between value-generating diagnostic activity and wasteful over-utilization; this distinction requires micro-level data on diagnostic yield and clinical outcomes.</w:t>
@@ -5128,7 +5138,7 @@
           <w:sz w:val="20"/>
           <w:vertAlign w:val="superscript"/>
         </w:rPr>
-        <w:t>30</w:t>
+        <w:t>29</w:t>
       </w:r>
       <w:r>
         <w:t>. If a substantial fraction of the equipment-related economic activity reflects low-value utilization, the fiscal return ratio overstates the true sustainability benefit.</w:t>
@@ -5137,6 +5147,16 @@
     <w:p>
       <w:r>
         <w:t>Moreover, the current service level has been maintained through excessive, often uncompensated physician overtime. Japan's physician density (2.5 per 1,000) is among the lowest in the OECD</w:t>
+      </w:r>
+      <w:r>
+        <w:rPr>
+          <w:sz w:val="20"/>
+          <w:vertAlign w:val="superscript"/>
+        </w:rPr>
+        <w:t>25</w:t>
+      </w:r>
+      <w:r>
+        <w:t>, yet Japanese patients enjoy the fastest access to specialist care globally. With the enforcement of work-style reform legislation capping physician overtime</w:t>
       </w:r>
       <w:r>
         <w:rPr>
@@ -5146,16 +5166,6 @@
         <w:t>26</w:t>
       </w:r>
       <w:r>
-        <w:t>, yet Japanese patients enjoy the fastest access to specialist care globally. With the enforcement of work-style reform legislation capping physician overtime</w:t>
-      </w:r>
-      <w:r>
-        <w:rPr>
-          <w:sz w:val="20"/>
-          <w:vertAlign w:val="superscript"/>
-        </w:rPr>
-        <w:t>27</w:t>
-      </w:r>
-      <w:r>
         <w:t>, maintaining current service levels may be practically impossible without either increasing physician numbers (which would raise labor costs and reduce the multiplier-based fiscal return) or reducing service volume (which would reduce equipment utilization and the multiplier itself). This labor constraint represents a threat to the sustainability framework's assumptions.</w:t>
       </w:r>
     </w:p>
@@ -5232,7 +5242,7 @@
           <w:sz w:val="20"/>
           <w:vertAlign w:val="superscript"/>
         </w:rPr>
-        <w:t>26</w:t>
+        <w:t>25</w:t>
       </w:r>
       <w:r>
         <w:t>.</w:t>
@@ -5248,7 +5258,7 @@
     </w:p>
     <w:p>
       <w:r>
-        <w:t>Several further limitations should be noted. First, I-O multipliers are static models that do not account for price adjustments, supply constraints, or general equilibrium effects. Second, the effective tax rate parameter may not fully capture the complexity of national tax systems. Third, import leakage was calculated using aggregate HS trade data and does not capture re-exports or domestic value-added content of imports. Fourth, the counterfactual scenarios are static partial-equilibrium models. Fifth, the tempo model integration relies on a companion analysis whose time-varying component (M2) does not robustly survive parsimony-aware model selection. Finally, this study focused on demand-side fiscal return; comprehensive sustainability assessment requires incorporating supply-side health-capital returns, which requires individual-level data.</w:t>
+        <w:t>Several further limitations should be noted. First, I-O multipliers are static models that do not account for price adjustments, supply constraints, or general equilibrium effects. Second, the effective tax rate parameter may not fully capture the complexity of national tax systems. Third, import leakage was calculated using aggregate HS trade data and does not capture re-exports or domestic value-added content of imports. Fourth, the counterfactual scenarios are static partial-equilibrium models. Fifth, the tempo model's time-varying component (M2) does not robustly survive parsimony-aware model selection. Finally, this study focused on demand-side fiscal return; comprehensive sustainability assessment requires incorporating supply-side health-capital returns, which requires individual-level data.</w:t>
       </w:r>
     </w:p>
     <w:p>
@@ -5261,7 +5271,7 @@
     </w:p>
     <w:p>
       <w:r>
-        <w:t>Japan's healthcare expenditure generates substantial demand-side economic returns via I-O multiplier effects, with an output-based fiscal return ratio of 1.09. However, whether these returns fully cover public healthcare costs depends on methodological choices: using value-added multipliers reduces the ratio below 1.0, and accounting for deficit financing further complicates the picture.</w:t>
+        <w:t>Japan's healthcare expenditure is a fiscally material economic sector, not merely a cost to be contained. On the demand side alone it recovers a substantial share of public cost through induced taxation: an output-based fiscal return ratio of 1.09, remaining at 1.04 after import-leakage adjustment, 0.67 after discounting for deficit financing, and 0.60 under the most conservative value-added treatment. The direction of this finding -- that healthcare carries an economic return of a magnitude comparable to other discretionary fiscal expenditures -- is robust across all four treatments; the conservative variants that fall below 1.0 do not negate the economic value but bound it, quantifying the extent to which the demand-side return alone falls short of full tax-based self-financing.</w:t>
       </w:r>
     </w:p>
     <w:p>
@@ -5276,7 +5286,7 @@
     </w:p>
     <w:p>
       <w:r>
-        <w:t>We conclude that healthcare expenditure should be evaluated through both cost and economic-return lenses, but that the framework presented here provides indicative ranges rather than definitive sustainability determinations. The policy debate should integrate economic return analysis alongside assessments of over-supply risk, workforce sustainability, deficit financing, and the age-specific structure of healthcare spending.</w:t>
+        <w:t>We conclude that healthcare expenditure should be evaluated through both cost and economic-return lenses, and that its economic return should be formally incorporated into fiscal evaluation rather than disregarded. The direction of interpretation is consistent and robust: the return is material on the demand side and is complemented by a genuine supply-side health-capital lag. Deficit-financing dependence, over-supply risk, workforce constraints, and the age-specific structure of spending are best understood as conditions on the sustainability of that return -- the axes along which it must be secured -- rather than as grounds for dismissing the economic value that the analysis establishes.</w:t>
       </w:r>
     </w:p>
     <w:p>
@@ -5814,7 +5824,7 @@
         <w:t xml:space="preserve">22. </w:t>
       </w:r>
       <w:r>
-        <w:t>Onishi T. The forgotten tempo effect in capital accounting: investment-to-output time-to-build, intangible capital, and the reconciliation of flow- and stock-based national wealth measures. Working Paper. 2026. Available from: https://github.com/bougtoir/gdp-tempo-paper</w:t>
+        <w:t>Kydland FE, Prescott EC. Time to build and aggregate fluctuations. Econometrica. 1982;50(6):1345-1370.</w:t>
       </w:r>
     </w:p>
     <w:p>
@@ -5825,7 +5835,7 @@
         <w:t xml:space="preserve">23. </w:t>
       </w:r>
       <w:r>
-        <w:t>Onishi T. Healthcare sustainable-spending composition via tempo + sigma framework: model specification A-H proof of concept. Working Paper. 2026. Available from: https://github.com/bougtoir/healthcare-sustainable</w:t>
+        <w:t>OECD. Health at a Glance 2023: OECD Indicators. Chapter 5.23: Diagnostic technologies. Paris: OECD Publishing; 2023.</w:t>
       </w:r>
     </w:p>
     <w:p>
@@ -5836,7 +5846,7 @@
         <w:t xml:space="preserve">24. </w:t>
       </w:r>
       <w:r>
-        <w:t>OECD. Health at a Glance 2023: OECD Indicators. Chapter 5.23: Diagnostic technologies. Paris: OECD Publishing; 2023.</w:t>
+        <w:t>Ministry of Health, Labour and Welfare. Pharmaceutical and medical device production statistics annual report. Tokyo: MHLW; 2021. [In Japanese]</w:t>
       </w:r>
     </w:p>
     <w:p>
@@ -5847,7 +5857,7 @@
         <w:t xml:space="preserve">25. </w:t>
       </w:r>
       <w:r>
-        <w:t>Ministry of Health, Labour and Welfare. Pharmaceutical and medical device production statistics annual report. Tokyo: MHLW; 2021. [In Japanese]</w:t>
+        <w:t>OECD. Health at a Glance 2023: OECD Indicators. Chapter 8.1: Health workforce. Paris: OECD Publishing; 2023.</w:t>
       </w:r>
     </w:p>
     <w:p>
@@ -5858,7 +5868,7 @@
         <w:t xml:space="preserve">26. </w:t>
       </w:r>
       <w:r>
-        <w:t>OECD. Health at a Glance 2023: OECD Indicators. Chapter 8.1: Health workforce. Paris: OECD Publishing; 2023.</w:t>
+        <w:t>Koike S, Wada H, Ohde S, Ide H, Taneda K, Tanigawa T. Working hours of full-time hospital physicians in Japan: a cross-sectional nationwide survey. BMC Public Health. 2024;24:164.</w:t>
       </w:r>
     </w:p>
     <w:p>
@@ -5869,7 +5879,7 @@
         <w:t xml:space="preserve">27. </w:t>
       </w:r>
       <w:r>
-        <w:t>Koike S, Wada H, Ohde S, Ide H, Taneda K, Tanigawa T. Working hours of full-time hospital physicians in Japan: a cross-sectional nationwide survey. BMC Public Health. 2024;24:164.</w:t>
+        <w:t>World Bank. World Development Indicators. Washington, DC: World Bank; 2024. Available from: https://databank.worldbank.org/</w:t>
       </w:r>
     </w:p>
     <w:p>
@@ -5880,7 +5890,7 @@
         <w:t xml:space="preserve">28. </w:t>
       </w:r>
       <w:r>
-        <w:t>World Bank. World Development Indicators. Washington, DC: World Bank; 2024. Available from: https://databank.worldbank.org/</w:t>
+        <w:t>Preston SH. The changing relation between mortality and level of economic development. Popul Stud. 1975;29(2):231-248.</w:t>
       </w:r>
     </w:p>
     <w:p>
@@ -5889,17 +5899,6 @@
           <w:b/>
         </w:rPr>
         <w:t xml:space="preserve">29. </w:t>
-      </w:r>
-      <w:r>
-        <w:t>Preston SH. The changing relation between mortality and level of economic development. Popul Stud. 1975;29(2):231-248.</w:t>
-      </w:r>
-    </w:p>
-    <w:p>
-      <w:r>
-        <w:rPr>
-          <w:b/>
-        </w:rPr>
-        <w:t xml:space="preserve">30. </w:t>
       </w:r>
       <w:r>
         <w:t>Hiyama T, Yoshihara M, Tanaka S, Urabe Y, Ikegami Y, Fukuhara T, et al. Defensive medicine practices among gastroenterologists in Japan. World J Gastroenterol. 2006;12(47):7671-7675.</w:t>

</xml_diff>